<commit_message>
Add Ukrainian technical configuration document
</commit_message>
<xml_diff>
--- a/ssh-qos-configuration.uk.docx
+++ b/ssh-qos-configuration.uk.docx
@@ -49,7 +49,7 @@
                 <w:sz w:val="52"/>
                 <w:szCs w:val="52"/>
               </w:rPr>
-              <w:t xml:space="preserve">Пріоритет SSH трафіку</w:t>
+              <w:t xml:space="preserve">SSH Пріоритет Трафіку</w:t>
             </w:r>
           </w:p>
           <w:p>
@@ -64,7 +64,7 @@
                 <w:sz w:val="28"/>
                 <w:szCs w:val="28"/>
               </w:rPr>
-              <w:t xml:space="preserve">Конфігурація QoS на ens3</w:t>
+              <w:t xml:space="preserve">QoS Конфігурація на ens3</w:t>
             </w:r>
           </w:p>
           <w:p>
@@ -124,7 +124,7 @@
           <w:sz w:val="22"/>
           <w:szCs w:val="22"/>
         </w:rPr>
-        <w:t xml:space="preserve">SSH це те як ми підключаємось до цього сервера і керуємо ним віддалено. Якщо сервер стає зайнятим, мережевий трафік може перевантажитись і SSH може стати повільним або зовсім відключитись. Втрата SSH доступу в момент коли щось іде не так означає втрату можливості це виправити.</w:t>
+        <w:t xml:space="preserve">SSH це те як ми підключаємось до цього сервера та керуємо ним віддалено. Якщо сервер стає зайнятим, мережевий трафік може перевантажитись і SSH може стати повільним або зовсім відключитись. Втрата SSH доступу саме в момент коли щось йде не так означає втрату можливості це виправити.</w:t>
       </w:r>
     </w:p>
     <w:p>
@@ -146,7 +146,7 @@
           <w:sz w:val="22"/>
           <w:szCs w:val="22"/>
         </w:rPr>
-        <w:t xml:space="preserve">Цей документ охоплює повну конфігурацію застосовану для надання SSH трафіку абсолютного найвищого пріоритету над усім іншим мережевим трафіком на інтерфейсі ens3, для IPv4 та IPv6.</w:t>
+        <w:t xml:space="preserve">Цей документ охоплює повну конфігурацію застосовану для надання SSH трафіку абсолютного найвищого пріоритету над усім іншим мережевим трафіком на інтерфейсі ens3, як для IPv4 так і для IPv6.</w:t>
       </w:r>
     </w:p>
     <w:p>
@@ -203,7 +203,7 @@
                 <w:sz w:val="22"/>
                 <w:szCs w:val="22"/>
               </w:rPr>
-              <w:t xml:space="preserve">Увага: </w:t>
+              <w:t xml:space="preserve">Примітка: </w:t>
             </w:r>
             <w:r>
               <w:rPr>
@@ -257,7 +257,7 @@
           <w:sz w:val="22"/>
           <w:szCs w:val="22"/>
         </w:rPr>
-        <w:t xml:space="preserve">Linux використовує інструмент tc (Traffic Control) для керування чергою і відправкою пакетів на мережевому інтерфейсі. За замовчуванням весь трафік обробляється однаково. Ми змінюємо це створюючи три пріоритетні смуги на ens3:</w:t>
+        <w:t xml:space="preserve">Linux використовує інструмент tc (Traffic Control) для управління чергами пакетів на мережевому інтерфейсі. За замовчуванням весь трафік обробляється однаково. Ми змінюємо це створюючи три пріоритетні смуги на ens3:</w:t>
       </w:r>
     </w:p>
     <w:p>
@@ -284,7 +284,7 @@
           <w:sz w:val="22"/>
           <w:szCs w:val="22"/>
         </w:rPr>
-        <w:t xml:space="preserve">Смуга 1:1 — Найвищий пріоритет (SSH трафік іде сюди)</w:t>
+        <w:t xml:space="preserve">Смуга 1:1 — Найвищий пріоритет (SSH трафік йде сюди)</w:t>
       </w:r>
     </w:p>
     <w:p>
@@ -303,7 +303,7 @@
           <w:sz w:val="22"/>
           <w:szCs w:val="22"/>
         </w:rPr>
-        <w:t xml:space="preserve">Смуга 1:2 — Звичайний пріоритет (більшість трафіку за замовчуванням)</w:t>
+        <w:t xml:space="preserve">Смуга 1:2 — Звичайний пріоритет (більшість трафіку тут за замовчуванням)</w:t>
       </w:r>
     </w:p>
     <w:p>
@@ -344,7 +344,7 @@
           <w:sz w:val="22"/>
           <w:szCs w:val="22"/>
         </w:rPr>
-        <w:t xml:space="preserve">Ядро повністю обробляє смугу 1:1 перш ніж торкатись 1:2 або 1:3. Тому SSH сесія продовжує працювати навіть якщо щось сильно навантажує мережу.</w:t>
+        <w:t xml:space="preserve">Ядро повністю обробляє смугу 1:1 перш ніж торкатись 1:2 або 1:3. Тому SSH сесія залишається стабільною навіть коли щось сильно навантажує мережу.</w:t>
       </w:r>
     </w:p>
     <w:p>
@@ -366,7 +366,7 @@
           <w:sz w:val="22"/>
           <w:szCs w:val="22"/>
         </w:rPr>
-        <w:t xml:space="preserve">Для IPv4 використовуються фільтри tc u32 що відповідають TCP порту 22 безпосередньо. Для IPv6 використовується ip6tables для маркування пакетів порту 22, потім фільтр tc fw перехоплює ці мітки і направляє їх в смугу 1:1.</w:t>
+        <w:t xml:space="preserve">Для IPv4 використовуються фільтри tc u32 що відповідають TCP порту 22 напряму. Для IPv6 використовується ip6tables для маркування пакетів порту 22, а потім фільтр tc fw перехоплює ці мітки і направляє їх до смуги 1:1.</w:t>
       </w:r>
     </w:p>
     <w:p>
@@ -394,7 +394,7 @@
           <w:sz w:val="32"/>
           <w:szCs w:val="32"/>
         </w:rPr>
-        <w:t xml:space="preserve">Крок 1: Негайне застосування правил</w:t>
+        <w:t xml:space="preserve">Крок 1: Застосування правил негайно</w:t>
       </w:r>
     </w:p>
     <w:p>
@@ -408,7 +408,7 @@
           <w:sz w:val="22"/>
           <w:szCs w:val="22"/>
         </w:rPr>
-        <w:t xml:space="preserve">Запустіть цей блок щоб застосувати всі правила прямо зараз. Він спочатку очищає будь-які існуючі правила тому його безпечно запускати кілька разів.</w:t>
+        <w:t xml:space="preserve">Запустіть цей блок щоб застосувати всі правила прямо зараз. Спочатку очищає будь-які існуючі правила тому безпечно запускати кілька разів.</w:t>
       </w:r>
     </w:p>
     <w:p>
@@ -747,7 +747,7 @@
                 <w:sz w:val="18"/>
                 <w:szCs w:val="18"/>
               </w:rPr>
-              <w:t xml:space="preserve"># IPv4: вхідні SSH відповіді до смуги найвищого пріоритету</w:t>
+              <w:t xml:space="preserve"># IPv4: відповіді вхідного SSH до смуги найвищого пріоритету</w:t>
             </w:r>
           </w:p>
           <w:p>
@@ -887,7 +887,7 @@
                 <w:sz w:val="18"/>
                 <w:szCs w:val="18"/>
               </w:rPr>
-              <w:t xml:space="preserve"># IPv6: маршрутизація помічених пакетів до смуги найвищого пріоритету</w:t>
+              <w:t xml:space="preserve"># IPv6: направлення маркованих пакетів до смуги найвищого пріоритету</w:t>
             </w:r>
           </w:p>
           <w:p>
@@ -946,7 +946,7 @@
           <w:sz w:val="22"/>
           <w:szCs w:val="22"/>
         </w:rPr>
-        <w:t xml:space="preserve">Правила tc та мітки ip6tables зникають після перезавантаження. Цей systemd сервіс автоматично відновлює все при кожному запуску сервера, до того як запускаються інші сервіси.</w:t>
+        <w:t xml:space="preserve">Правила tc та мітки ip6tables зникають після перезавантаження. Ця служба systemd автоматично повторно застосовує все при кожному завантаженні сервера.</w:t>
       </w:r>
     </w:p>
     <w:p>
@@ -1003,7 +1003,7 @@
                 <w:sz w:val="24"/>
                 <w:szCs w:val="24"/>
               </w:rPr>
-              <w:t xml:space="preserve">Створити та активувати systemd сервіс</w:t>
+              <w:t xml:space="preserve">Створити та увімкнути службу systemd</w:t>
             </w:r>
           </w:p>
         </w:tc>
@@ -1777,20 +1777,6 @@
                 <w:sz w:val="18"/>
                 <w:szCs w:val="18"/>
               </w:rPr>
-              <w:t xml:space="preserve">filter parent 1: protocol ip pref 1 u32 chain 0</w:t>
-            </w:r>
-          </w:p>
-          <w:p>
-            <w:pPr>
-              <w:spacing w:after="0" w:before="0"/>
-            </w:pPr>
-            <w:r>
-              <w:rPr>
-                <w:rFonts w:ascii="Courier New" w:cs="Courier New" w:eastAsia="Courier New" w:hAnsi="Courier New"/>
-                <w:color w:val="1A1A1A"/>
-                <w:sz w:val="18"/>
-                <w:szCs w:val="18"/>
-              </w:rPr>
               <w:t xml:space="preserve">filter parent 1: protocol ip pref 1 u32 chain 0 fh 800::800 ... *flowid 1:1</w:t>
             </w:r>
           </w:p>
@@ -2018,7 +2004,7 @@
           <w:sz w:val="22"/>
           <w:szCs w:val="22"/>
         </w:rPr>
-        <w:t xml:space="preserve">Рядки 2 і 3 мають показувати MARK set 0x1 для tcp dpt:ssh та tcp spt:ssh.</w:t>
+        <w:t xml:space="preserve">Мають бути присутні рядки з MARK set 0x1 для tcp dpt:ssh та tcp spt:ssh.</w:t>
       </w:r>
     </w:p>
     <w:p>
@@ -2075,7 +2061,7 @@
                 <w:sz w:val="24"/>
                 <w:szCs w:val="24"/>
               </w:rPr>
-              <w:t xml:space="preserve">Перевірити статус сервісу</w:t>
+              <w:t xml:space="preserve">Перевірити статус служби</w:t>
             </w:r>
           </w:p>
         </w:tc>
@@ -2200,7 +2186,7 @@
           <w:sz w:val="22"/>
           <w:szCs w:val="22"/>
         </w:rPr>
-        <w:t xml:space="preserve">Щоб повністю видалити пріоритет SSH QoS і зупинити його відновлення після перезавантаження:</w:t>
+        <w:t xml:space="preserve">Щоб повністю видалити пріоритет SSH та зупинити його повернення після перезавантаження:</w:t>
       </w:r>
     </w:p>
     <w:p>
@@ -2359,21 +2345,7 @@
           <w:sz w:val="22"/>
           <w:szCs w:val="22"/>
         </w:rPr>
-        <w:t xml:space="preserve">Стандартний priomap qdisc prio: 1 2 2 2 1 2 0 0 1 1 1 1 1 1 1 1</w:t>
-      </w:r>
-    </w:p>
-    <w:p>
-      <w:pPr>
-        <w:spacing w:after="80" w:before="80"/>
-      </w:pPr>
-      <w:r>
-        <w:rPr>
-          <w:rFonts w:ascii="Arial" w:cs="Arial" w:eastAsia="Arial" w:hAnsi="Arial"/>
-          <w:color w:val="333333"/>
-          <w:sz w:val="22"/>
-          <w:szCs w:val="22"/>
-        </w:rPr>
-        <w:t xml:space="preserve">Це направляє більшість звичайного трафіку до смуг 1:2 та 1:3. Наші фільтри явно направляють SSH в 1:1. Встановлення всіх значень priomap в 0 — поширена помилка яка ставить все в 1:1, тому SSH не отримує жодної реальної переваги.</w:t>
+        <w:t xml:space="preserve">Стандартний priomap: 1 2 2 2 1 2 0 0 1 1 1 1 1 1 1 1. Більшість трафіку потрапляє до смуг 1:2 та 1:3. Фільтри явно переміщують SSH до 1:1. Встановлення всіх значень в 0 помістило б все до 1:1 — поширена помилка що позбавляє SSH будь-якої переваги.</w:t>
       </w:r>
     </w:p>
     <w:p>
@@ -2398,7 +2370,7 @@
           <w:sz w:val="26"/>
           <w:szCs w:val="26"/>
         </w:rPr>
-        <w:t xml:space="preserve">Чому match tcp dst, а не match ip dport</w:t>
+        <w:t xml:space="preserve">Чому match tcp dst а не match ip dport</w:t>
       </w:r>
     </w:p>
     <w:p>
@@ -2412,7 +2384,7 @@
           <w:sz w:val="22"/>
           <w:szCs w:val="22"/>
         </w:rPr>
-        <w:t xml:space="preserve">Селектор tcp в tc u32 використовує dst та src для портів, а не dport та sport. Ті належать селектору ip. Використання неправильного ключового слова призводить до того що tc мовчки відхиляє фільтр.</w:t>
+        <w:t xml:space="preserve">Селектор tcp в tc u32 використовує dst та src для портів, а не dport та sport. Ці ключові слова належать селектору ip. Використання неправильного ключового слова змушує tc мовчки відхилити фільтр.</w:t>
       </w:r>
     </w:p>
     <w:p>
@@ -2451,7 +2423,7 @@
           <w:sz w:val="22"/>
           <w:szCs w:val="22"/>
         </w:rPr>
-        <w:t xml:space="preserve">На ядрі 6.8.0-111-generic фільтри tc u32 IPv6 з селектором ip6 не працюють. Підхід з мітками ip6tables є надійним обхідним рішенням: ip6tables мітить відповідні пакети значенням fwmark 1, а фільтр tc fw на prio 2 перехоплює все з цією міткою і направляє в смугу 1:1.</w:t>
+        <w:t xml:space="preserve">На ядрі 6.8.0-111-generic фільтри tc u32 IPv6 не працюють. Підхід з мітками ip6tables є надійним обхідним рішенням: ip6tables маркує пакети значенням fwmark 1, а фільтр tc fw перехоплює їх і направляє до смуги 1:1.</w:t>
       </w:r>
     </w:p>
     <w:p>
@@ -2490,7 +2462,7 @@
           <w:sz w:val="22"/>
           <w:szCs w:val="22"/>
         </w:rPr>
-        <w:t xml:space="preserve">Цей сервер працює на QEMU/KVM (MAC префікс 52:54:00). На віртуальних машинах network.target не гарантує що конкретні інтерфейси як ens3 вже повністю налаштовані. network-online.target чекає поки хоча б один інтерфейс буде повністю онлайн перш ніж сервіс запуститься.</w:t>
+        <w:t xml:space="preserve">На віртуальних машинах QEMU/KVM (MAC префікс 52:54:00) network.target не гарантує що інтерфейс ens3 вже налаштований. network-online.target чекає поки мережа буде готова перед запуском служби.</w:t>
       </w:r>
     </w:p>
     <w:p>
@@ -2515,7 +2487,7 @@
           <w:sz w:val="26"/>
           <w:szCs w:val="26"/>
         </w:rPr>
-        <w:t xml:space="preserve">Чому сервіс очищає перед застосуванням</w:t>
+        <w:t xml:space="preserve">Чому служба очищає перед застосуванням</w:t>
       </w:r>
     </w:p>
     <w:p>
@@ -2529,7 +2501,7 @@
           <w:sz w:val="22"/>
           <w:szCs w:val="22"/>
         </w:rPr>
-        <w:t xml:space="preserve">tc filter add завершується з помилкою якщо відповідний фільтр вже існує. Попереднє очищення з 2&gt;/dev/null || true робить сервіс повністю ідемпотентним — безпечним для запуску, зупинки та перезапуску будь-яку кількість разів.</w:t>
+        <w:t xml:space="preserve">tc filter add завершується помилкою якщо фільтр вже існує. Попереднє очищення через 2&gt;/dev/null || true робить службу повністю ідемпотентною — безпечною для запуску та перезапуску будь-яку кількість разів.</w:t>
       </w:r>
     </w:p>
     <w:sectPr>
@@ -2597,7 +2569,7 @@
         <w:sz w:val="18"/>
         <w:szCs w:val="18"/>
       </w:rPr>
-      <w:t xml:space="preserve">Конфігурація SSH QoS  |  Сервер s273032  |  Сторінка </w:t>
+      <w:t xml:space="preserve">SSH QoS Конфігурація  |  Сервер s273032  |  Сторінка </w:t>
     </w:r>
     <w:r>
       <w:rPr>

</xml_diff>